<commit_message>
Drop NEXT_PUBLIC_ prefix from the Supabase URL / anon key / app URL
The browser-side Supabase client was unused (every interaction goes through
server actions), so nothing needed the public prefix — it only exposed the
values to the client bundle for no reason. Renamed:

  NEXT_PUBLIC_SUPABASE_URL       -> SUPABASE_URL
  NEXT_PUBLIC_SUPABASE_ANON_KEY  -> SUPABASE_ANON_KEY
  NEXT_PUBLIC_APP_URL            -> APP_URL

lib/env.ts still reads the old names as a fallback so a partially migrated
host keeps working; remove the NEXT_PUBLIC_* vars from Vercel once the new
names are set. Deleted the unused lib/supabase/client.ts. The genuine secrets
(SUPABASE_SERVICE_ROLE_KEY, CRON_SECRET, RESEND_API_KEY, ANTHROPIC_API_KEY,
RECALL_*) were already correctly un-prefixed.

Docs, scripts, .env.example and the guide updated. Regenerated the Word guide.

Co-Authored-By: Claude Sonnet 5 <noreply@anthropic.com>
Claude-Session: https://claude.ai/code/session_01KkZPb6bsaZv5pWjqtCtUp5
</commit_message>
<xml_diff>
--- a/docs/Deccan Birders EC Portal — Complete Guide.docx
+++ b/docs/Deccan Birders EC Portal — Complete Guide.docx
@@ -1361,7 +1361,7 @@
         <w:rPr>
           <w:rStyle w:val="VerbatimChar"/>
         </w:rPr>
-        <w:t xml:space="preserve">NEXT_PUBLIC_SUPABASE_URL       = https://wmpuxjlfqujvfsehqjnt.supabase.co</w:t>
+        <w:t xml:space="preserve">SUPABASE_URL       = https://wmpuxjlfqujvfsehqjnt.supabase.co</w:t>
       </w:r>
       <w:r>
         <w:br/>
@@ -1370,7 +1370,7 @@
         <w:rPr>
           <w:rStyle w:val="VerbatimChar"/>
         </w:rPr>
-        <w:t xml:space="preserve">NEXT_PUBLIC_SUPABASE_ANON_KEY  = &lt;anon key — Supabase → Settings → API&gt;</w:t>
+        <w:t xml:space="preserve">SUPABASE_ANON_KEY  = &lt;anon key — Supabase → Settings → API&gt;</w:t>
       </w:r>
       <w:r>
         <w:br/>
@@ -1388,7 +1388,7 @@
         <w:rPr>
           <w:rStyle w:val="VerbatimChar"/>
         </w:rPr>
-        <w:t xml:space="preserve">NEXT_PUBLIC_APP_URL            = https://&lt;your-project&gt;.vercel.app</w:t>
+        <w:t xml:space="preserve">APP_URL            = https://&lt;your-project&gt;.vercel.app</w:t>
       </w:r>
       <w:r>
         <w:br/>
@@ -1615,7 +1615,7 @@
         <w:rPr>
           <w:rStyle w:val="VerbatimChar"/>
         </w:rPr>
-        <w:t xml:space="preserve">NEXT_PUBLIC_APP_URL</w:t>
+        <w:t xml:space="preserve">APP_URL</w:t>
       </w:r>
       <w:r>
         <w:t xml:space="preserve">.</w:t>
@@ -1689,7 +1689,7 @@
         <w:rPr>
           <w:rStyle w:val="VerbatimChar"/>
         </w:rPr>
-        <w:t xml:space="preserve">NEXT_PUBLIC_APP_URL</w:t>
+        <w:t xml:space="preserve">APP_URL</w:t>
       </w:r>
       <w:r>
         <w:t xml:space="preserve"> </w:t>
@@ -9543,7 +9543,7 @@
               <w:rPr>
                 <w:rStyle w:val="VerbatimChar"/>
               </w:rPr>
-              <w:t xml:space="preserve">NEXT_PUBLIC_SUPABASE_URL</w:t>
+              <w:t xml:space="preserve">SUPABASE_URL</w:t>
             </w:r>
           </w:p>
         </w:tc>
@@ -9584,7 +9584,7 @@
               <w:rPr>
                 <w:rStyle w:val="VerbatimChar"/>
               </w:rPr>
-              <w:t xml:space="preserve">NEXT_PUBLIC_SUPABASE_ANON_KEY</w:t>
+              <w:t xml:space="preserve">SUPABASE_ANON_KEY</w:t>
             </w:r>
           </w:p>
         </w:tc>
@@ -9660,7 +9660,7 @@
               <w:rPr>
                 <w:rStyle w:val="VerbatimChar"/>
               </w:rPr>
-              <w:t xml:space="preserve">NEXT_PUBLIC_APP_URL</w:t>
+              <w:t xml:space="preserve">APP_URL</w:t>
             </w:r>
           </w:p>
         </w:tc>

</xml_diff>